<commit_message>
proof: normalize canonical vault schema
</commit_message>
<xml_diff>
--- a/demo-output/accepted-generation-1.docx
+++ b/demo-output/accepted-generation-1.docx
@@ -1603,7 +1603,7 @@
                 <w:sz w:val="22"/>
                 <w:szCs w:val="22"/>
               </w:rPr>
-              <w:t xml:space="preserve">Greensboro, NC 27401</w:t>
+              <w:t xml:space="preserve">Greensboro, North Carolina 27401</w:t>
             </w:r>
           </w:p>
           <w:p>
@@ -1674,7 +1674,7 @@
                 <w:sz w:val="22"/>
                 <w:szCs w:val="22"/>
               </w:rPr>
-              <w:t xml:space="preserve">High Point, NC 27260</w:t>
+              <w:t xml:space="preserve">High Point, North Carolina 27260</w:t>
             </w:r>
           </w:p>
         </w:tc>

</xml_diff>

<commit_message>
fix: preserve vault upgrades and require generation provenance
</commit_message>
<xml_diff>
--- a/demo-output/accepted-generation-1.docx
+++ b/demo-output/accepted-generation-1.docx
@@ -152,7 +152,7 @@
           <w:sz w:val="22"/>
           <w:szCs w:val="22"/>
         </w:rPr>
-        <w:t xml:space="preserve">- This Agreement shall commence on 2026-07-14 and shall continue for a period of One (1) years unless sooner terminated as hereinafter set forth.  </w:t>
+        <w:t xml:space="preserve">- This Agreement shall commence on 2026-07-15 and shall continue for a period of One (1 year) unless sooner terminated as hereinafter set forth.  </w:t>
       </w:r>
     </w:p>
     <w:p>
@@ -240,7 +240,13 @@
               <w:jc w:val="center"/>
             </w:pPr>
             <w:r>
-              <w:t xml:space="preserve">Provide independent product-design consulting and written recommendations for the owner's widget catalog.</w:t>
+              <w:t xml:space="preserve">Provide the expressly reviewed services and written deliverables described by the parties</w:t>
+            </w:r>
+            <w:r>
+              <w:br/>
+            </w:r>
+            <w:r>
+              <w:t xml:space="preserve">Compensation structure: Fixed fee.</w:t>
             </w:r>
           </w:p>
           <w:p>
@@ -318,7 +324,7 @@
           <w:sz w:val="22"/>
           <w:szCs w:val="22"/>
         </w:rPr>
-        <w:t xml:space="preserve"> - Owner's obligation to Contractor is to pay commissions as set forth in writing in this Agreement.  Owner shall have no additional or further obligation to pay or reimburse Contractor for expenses of overhead, insurance, taxes, vehicle use or otherwise, except as the parties may agree by written agreement signed by both parties.</w:t>
+        <w:t xml:space="preserve"> - Owner's obligation to Contractor is to provide the compensation structure expressly confirmed in the Scope of Agreement.  Owner shall have no additional or further obligation to pay or reimburse Contractor for expenses of overhead, insurance, taxes, vehicle use or otherwise, except as the parties may agree by written agreement signed by both parties.</w:t>
       </w:r>
     </w:p>
     <w:p>
@@ -553,7 +559,7 @@
           <w:sz w:val="22"/>
           <w:szCs w:val="22"/>
         </w:rPr>
-        <w:t xml:space="preserve">- In the event of termination, the departing Contractor agrees not to visit the premises of Owner without express permission and agrees to make no remarks unfavorable to Owner to the remaining employees or customers of the Owner. The departing Contractor agrees to engage in no activity that can, could, does or might disrupt the business of Owner.  Contractor agrees Contractor shall not, for One (1) years following the termination of this Agreement, employ or engage any other employee of Owner in any capacity, nor contact nor solicit the business of any person, firm or corporation who had been a customer of Owner or a supply source of Owner during the year prior to Contractor’s termination if the action by Contractor can, could, does or might disrupt the business of the Owner.</w:t>
+        <w:t xml:space="preserve">- In the event of termination, the departing Contractor agrees not to visit the premises of Owner without express permission and agrees to make no remarks unfavorable to Owner to the remaining employees or customers of the Owner. The departing Contractor agrees to engage in no activity that can, could, does or might disrupt the business of Owner.  Contractor agrees Contractor shall not, for One (1 year) following the termination of this Agreement, employ or engage any other employee of Owner in any capacity, nor contact nor solicit the business of any person, firm or corporation who had been a customer of Owner or a supply source of Owner during the year prior to Contractor’s termination if the action by Contractor can, could, does or might disrupt the business of the Owner.</w:t>
       </w:r>
     </w:p>
     <w:p>
@@ -601,7 +607,7 @@
           <w:sz w:val="22"/>
           <w:szCs w:val="22"/>
         </w:rPr>
-        <w:t xml:space="preserve"> - Contractor acknowledges that Owner has a legitimate interest in protecting its customer base developed over the years, its skilled, trained employee base, and the viability and integrity of the business.  During the terms of this Agreement and following termination of this Agreement, for any reason whatsoever, Contractor shall not, for a period of One (1) years from the date of termination (excluding, however any period of </w:t>
+        <w:t xml:space="preserve"> - Contractor acknowledges that Owner has a legitimate interest in protecting its customer base developed over the years, its skilled, trained employee base, and the viability and integrity of the business.  During the terms of this Agreement and following termination of this Agreement, for any reason whatsoever, Contractor shall not, for a period of One (1 year) from the date of termination (excluding, however any period of </w:t>
       </w:r>
       <w:r>
         <w:rPr>
@@ -611,7 +617,7 @@
           <w:szCs w:val="22"/>
         </w:rPr>
         <w:lastRenderedPageBreak/>
-        <w:t xml:space="preserve">violation or any periods of time required by litigation to enforce this covenant), engage directly or indirectly, as a principal, employee, agent, consultant or in other capacity, alone or in association with others, in a business the same or similar to that of Owner within 25 miles of any office or branch operated by Owner (or within the states of North Carolina_,_______).  As used herein, the expression “a business the same or similar to that of Owner” means the business of Manufacture and sell commercial widgets..  In the event any court of competent jurisdiction shall determine that this restriction is unreasonable as to time or territory, the time shall be deemed amended by the parties to read 1 years if the Court finds the period unreasonable as to time, and the territory shall be deemed to read 25 miles of the branch operated by Owner if the territorial restriction shall be deemed to be unreasonable.  See </w:t>
+        <w:t xml:space="preserve">violation or any periods of time required by litigation to enforce this covenant), engage directly or indirectly, as a principal, employee, agent, consultant or in other capacity, alone or in association with others, in a business the same or similar to that of Owner within 25 miles of any office or branch operated by Owner (or within the states of North Carolina).  As used herein, the expression “a business the same or similar to that of Owner” means the business of Operate a North Carolina business for the tested engagement.  In the event any court of competent jurisdiction shall determine that this restriction is unreasonable as to time or territory, the time shall be deemed amended by the parties to read 1 year if the Court finds the period unreasonable as to time, and the territory shall be deemed to read 25 miles of the branch operated by Owner if the territorial restriction shall be deemed to be unreasonable.  See </w:t>
       </w:r>
       <w:r>
         <w:rPr>
@@ -733,7 +739,7 @@
           <w:sz w:val="22"/>
           <w:szCs w:val="22"/>
         </w:rPr>
-        <w:t xml:space="preserve">Contractor also agrees Contractor will not, directly or indirectly, during the term of this Agreement and One (1) years thereafter, hire away or attempt to hire away any employee of Owner.</w:t>
+        <w:t xml:space="preserve">Contractor also agrees Contractor will not, directly or indirectly, during the term of this Agreement and One (1 year) thereafter, hire away or attempt to hire away any employee of Owner.</w:t>
       </w:r>
     </w:p>
     <w:p>
@@ -1746,7 +1752,7 @@
           <w:sz w:val="22"/>
           <w:szCs w:val="22"/>
         </w:rPr>
-        <w:t>- Contractor shall assign not any right or interest under this Agreement or delegate any work or services under this Agreement without the prior written consent of Owner. Any attempted assignment in contravention of this paragraph shall be void and ineffective.</w:t>
+        <w:t>- Contractor shall not assign any right or interest under this Agreement or delegate any work or services under this Agreement without the prior written consent of Owner. Any attempted assignment in contravention of this paragraph shall be void and ineffective.</w:t>
       </w:r>
     </w:p>
     <w:p>
@@ -2217,503 +2223,120 @@
           <w:p>
             <w:pPr>
               <w:spacing w:line="216" w:lineRule="auto"/>
-              <w:jc w:val="both"/>
-              <w:rPr>
-                <w:rFonts w:ascii="Times New Roman" w:eastAsia="Times New Roman" w:hAnsi="Times New Roman" w:cs="Times New Roman"/>
-                <w:b/>
-                <w:bCs/>
-                <w:color w:val="000000"/>
-                <w:sz w:val="22"/>
-                <w:szCs w:val="22"/>
-              </w:rPr>
             </w:pPr>
             <w:r>
               <w:rPr>
                 <w:rFonts w:ascii="Times New Roman" w:eastAsia="Times New Roman" w:hAnsi="Times New Roman" w:cs="Times New Roman"/>
                 <w:b/>
                 <w:bCs/>
-                <w:color w:val="000000"/>
                 <w:sz w:val="22"/>
                 <w:szCs w:val="22"/>
               </w:rPr>
-              <w:t xml:space="preserve">OWNER                         </w:t>
+              <w:t xml:space="preserve">OWNER: Acme Widgets LLC</w:t>
             </w:r>
           </w:p>
-        </w:tc>
-        <w:tc>
-          <w:tcPr>
-            <w:tcW w:w="5035" w:type="dxa"/>
-            <w:vAlign w:val="bottom"/>
-          </w:tcPr>
           <w:p>
             <w:pPr>
               <w:spacing w:line="216" w:lineRule="auto"/>
+            </w:pPr>
+            <w:r>
               <w:rPr>
                 <w:rFonts w:ascii="Times New Roman" w:eastAsia="Times New Roman" w:hAnsi="Times New Roman" w:cs="Times New Roman"/>
-                <w:b/>
-                <w:bCs/>
-                <w:color w:val="000000"/>
                 <w:sz w:val="22"/>
                 <w:szCs w:val="22"/>
               </w:rPr>
+              <w:t xml:space="preserve">By: _____________________________ (SEAL)</w:t>
+            </w:r>
+          </w:p>
+          <w:p>
+            <w:pPr>
+              <w:spacing w:line="216" w:lineRule="auto"/>
+            </w:pPr>
+            <w:r>
+              <w:rPr>
+                <w:rFonts w:ascii="Times New Roman" w:eastAsia="Times New Roman" w:hAnsi="Times New Roman" w:cs="Times New Roman"/>
+                <w:sz w:val="22"/>
+                <w:szCs w:val="22"/>
+              </w:rPr>
+              <w:t xml:space="preserve">Alex Owner</w:t>
+            </w:r>
+            <w:r>
+              <w:br/>
+            </w:r>
+            <w:r>
+              <w:rPr>
+                <w:rFonts w:ascii="Times New Roman" w:eastAsia="Times New Roman" w:hAnsi="Times New Roman" w:cs="Times New Roman"/>
+                <w:sz w:val="22"/>
+                <w:szCs w:val="22"/>
+              </w:rPr>
+              <w:t xml:space="preserve">Title/Capacity: Managing Member</w:t>
+            </w:r>
+          </w:p>
+          <w:p>
+            <w:pPr>
+              <w:spacing w:line="216" w:lineRule="auto"/>
+            </w:pPr>
+            <w:r>
+              <w:rPr>
+                <w:rFonts w:ascii="Times New Roman" w:eastAsia="Times New Roman" w:hAnsi="Times New Roman" w:cs="Times New Roman"/>
+                <w:sz w:val="22"/>
+                <w:szCs w:val="22"/>
+              </w:rPr>
+              <w:t xml:space="preserve">Date: </w:t>
+            </w:r>
+          </w:p>
+          <w:p>
+            <w:pPr>
+              <w:spacing w:line="216" w:lineRule="auto"/>
             </w:pPr>
             <w:r>
               <w:rPr>
                 <w:rFonts w:ascii="Times New Roman" w:eastAsia="Times New Roman" w:hAnsi="Times New Roman" w:cs="Times New Roman"/>
                 <w:b/>
                 <w:bCs/>
-                <w:color w:val="000000"/>
                 <w:sz w:val="22"/>
                 <w:szCs w:val="22"/>
               </w:rPr>
-              <w:t>CONTRACTOR</w:t>
-            </w:r>
-          </w:p>
-        </w:tc>
-      </w:tr>
-      <w:tr>
-        <w:tc>
-          <w:tcPr>
-            <w:tcW w:w="5035" w:type="dxa"/>
-          </w:tcPr>
-          <w:p>
-            <w:pPr>
-              <w:spacing w:line="216" w:lineRule="auto"/>
-              <w:jc w:val="both"/>
-              <w:rPr>
-                <w:rFonts w:ascii="Times New Roman" w:eastAsia="Times New Roman" w:hAnsi="Times New Roman" w:cs="Times New Roman"/>
-                <w:b/>
-                <w:bCs/>
-                <w:color w:val="000000"/>
-                <w:sz w:val="22"/>
-                <w:szCs w:val="22"/>
-              </w:rPr>
-            </w:pPr>
-          </w:p>
-          <w:p>
-            <w:pPr>
-              <w:spacing w:line="216" w:lineRule="auto"/>
-              <w:jc w:val="both"/>
-              <w:rPr>
-                <w:rFonts w:ascii="Times New Roman" w:eastAsia="Times New Roman" w:hAnsi="Times New Roman" w:cs="Times New Roman"/>
-                <w:b/>
-                <w:bCs/>
-                <w:color w:val="000000"/>
-                <w:sz w:val="22"/>
-                <w:szCs w:val="22"/>
-              </w:rPr>
-            </w:pPr>
-          </w:p>
-          <w:p>
-            <w:pPr>
-              <w:spacing w:line="216" w:lineRule="auto"/>
-              <w:jc w:val="both"/>
-              <w:rPr>
-                <w:rFonts w:ascii="Times New Roman" w:eastAsia="Times New Roman" w:hAnsi="Times New Roman" w:cs="Times New Roman"/>
-                <w:b/>
-                <w:bCs/>
-                <w:color w:val="000000"/>
-                <w:sz w:val="22"/>
-                <w:szCs w:val="22"/>
-              </w:rPr>
-            </w:pPr>
-          </w:p>
-          <w:p>
-            <w:pPr>
-              <w:spacing w:line="216" w:lineRule="auto"/>
-              <w:jc w:val="both"/>
-              <w:rPr>
-                <w:rFonts w:ascii="Times New Roman" w:eastAsia="Times New Roman" w:hAnsi="Times New Roman" w:cs="Times New Roman"/>
-                <w:b/>
-                <w:bCs/>
-                <w:color w:val="000000"/>
-                <w:sz w:val="22"/>
-                <w:szCs w:val="22"/>
-              </w:rPr>
-            </w:pPr>
-          </w:p>
-          <w:p>
-            <w:pPr>
-              <w:spacing w:line="216" w:lineRule="auto"/>
-              <w:jc w:val="both"/>
-              <w:rPr>
-                <w:rFonts w:ascii="Times New Roman" w:eastAsia="Times New Roman" w:hAnsi="Times New Roman" w:cs="Times New Roman"/>
-                <w:b/>
-                <w:bCs/>
-                <w:color w:val="000000"/>
-                <w:sz w:val="22"/>
-                <w:szCs w:val="22"/>
-              </w:rPr>
-            </w:pPr>
-          </w:p>
-          <w:p>
-            <w:pPr>
-              <w:spacing w:line="216" w:lineRule="auto"/>
-              <w:jc w:val="both"/>
-              <w:rPr>
-                <w:rFonts w:ascii="Times New Roman" w:eastAsia="Times New Roman" w:hAnsi="Times New Roman" w:cs="Times New Roman"/>
-                <w:b/>
-                <w:bCs/>
-                <w:color w:val="000000"/>
-                <w:sz w:val="22"/>
-                <w:szCs w:val="22"/>
-              </w:rPr>
-            </w:pPr>
-            <w:r>
-              <w:rPr>
-                <w:rFonts w:ascii="Times New Roman" w:eastAsia="Times New Roman" w:hAnsi="Times New Roman" w:cs="Times New Roman"/>
-                <w:b/>
-                <w:bCs/>
-                <w:color w:val="000000"/>
-                <w:sz w:val="22"/>
-                <w:szCs w:val="22"/>
-              </w:rPr>
-              <w:t>_____________________________ (</w:t>
-            </w:r>
-            <w:proofErr w:type="gramStart"/>
-            <w:r>
-              <w:rPr>
-                <w:rFonts w:ascii="Times New Roman" w:eastAsia="Times New Roman" w:hAnsi="Times New Roman" w:cs="Times New Roman"/>
-                <w:b/>
-                <w:bCs/>
-                <w:color w:val="000000"/>
-                <w:sz w:val="22"/>
-                <w:szCs w:val="22"/>
-              </w:rPr>
-              <w:t xml:space="preserve">SEAL)   </w:t>
-            </w:r>
-            <w:proofErr w:type="gramEnd"/>
-            <w:r>
-              <w:rPr>
-                <w:rFonts w:ascii="Times New Roman" w:eastAsia="Times New Roman" w:hAnsi="Times New Roman" w:cs="Times New Roman"/>
-                <w:b/>
-                <w:bCs/>
-                <w:color w:val="000000"/>
-                <w:sz w:val="22"/>
-                <w:szCs w:val="22"/>
-              </w:rPr>
-              <w:t xml:space="preserve">    </w:t>
-            </w:r>
-          </w:p>
-        </w:tc>
-        <w:tc>
-          <w:tcPr>
-            <w:tcW w:w="5035" w:type="dxa"/>
-            <w:vAlign w:val="bottom"/>
-          </w:tcPr>
-          <w:p>
-            <w:pPr>
-              <w:spacing w:line="216" w:lineRule="auto"/>
-              <w:rPr>
-                <w:rFonts w:ascii="Times New Roman" w:eastAsia="Times New Roman" w:hAnsi="Times New Roman" w:cs="Times New Roman"/>
-                <w:b/>
-                <w:bCs/>
-                <w:color w:val="000000"/>
-                <w:sz w:val="22"/>
-                <w:szCs w:val="22"/>
-              </w:rPr>
-            </w:pPr>
-            <w:r>
-              <w:rPr>
-                <w:rFonts w:ascii="Times New Roman" w:eastAsia="Times New Roman" w:hAnsi="Times New Roman" w:cs="Times New Roman"/>
-                <w:b/>
-                <w:bCs/>
-                <w:color w:val="000000"/>
-                <w:sz w:val="22"/>
-                <w:szCs w:val="22"/>
-              </w:rPr>
-              <w:t>_____________________________ (SEAL)</w:t>
-            </w:r>
-          </w:p>
-        </w:tc>
-      </w:tr>
-      <w:tr>
-        <w:tc>
-          <w:tcPr>
-            <w:tcW w:w="5035" w:type="dxa"/>
-          </w:tcPr>
-          <w:p>
-            <w:pPr>
-              <w:spacing w:line="216" w:lineRule="auto"/>
-              <w:jc w:val="both"/>
-              <w:rPr>
-                <w:rFonts w:ascii="Times New Roman" w:eastAsia="Times New Roman" w:hAnsi="Times New Roman" w:cs="Times New Roman"/>
-                <w:b/>
-                <w:bCs/>
-                <w:color w:val="000000"/>
-                <w:sz w:val="22"/>
-                <w:szCs w:val="22"/>
-              </w:rPr>
-            </w:pPr>
-          </w:p>
-        </w:tc>
-        <w:tc>
-          <w:tcPr>
-            <w:tcW w:w="5035" w:type="dxa"/>
-            <w:vAlign w:val="bottom"/>
-          </w:tcPr>
-          <w:p>
-            <w:pPr>
-              <w:spacing w:line="216" w:lineRule="auto"/>
-              <w:rPr>
-                <w:rFonts w:ascii="Times New Roman" w:eastAsia="Times New Roman" w:hAnsi="Times New Roman" w:cs="Times New Roman"/>
-                <w:b/>
-                <w:bCs/>
-                <w:color w:val="000000"/>
-                <w:sz w:val="22"/>
-                <w:szCs w:val="22"/>
-              </w:rPr>
-            </w:pPr>
-          </w:p>
-        </w:tc>
-      </w:tr>
-      <w:tr>
-        <w:trPr>
-          <w:trHeight w:val="58"/>
-        </w:trPr>
-        <w:tc>
-          <w:tcPr>
-            <w:tcW w:w="5035" w:type="dxa"/>
-          </w:tcPr>
-          <w:p>
-            <w:pPr>
-              <w:spacing w:line="216" w:lineRule="auto"/>
-              <w:jc w:val="both"/>
-              <w:rPr>
-                <w:rFonts w:ascii="Times New Roman" w:eastAsia="Times New Roman" w:hAnsi="Times New Roman" w:cs="Times New Roman"/>
-                <w:color w:val="000000"/>
-                <w:sz w:val="22"/>
-                <w:szCs w:val="22"/>
-              </w:rPr>
-            </w:pPr>
-            <w:r>
-              <w:rPr>
-                <w:rFonts w:ascii="Times New Roman" w:eastAsia="Times New Roman" w:hAnsi="Times New Roman" w:cs="Times New Roman"/>
-                <w:color w:val="000000"/>
-                <w:sz w:val="22"/>
-                <w:szCs w:val="22"/>
-              </w:rPr>
-              <w:t xml:space="preserve">Alex Morgan </w:t>
-            </w:r>
-            <w:r>
-              <w:rPr>
-                <w:rFonts w:ascii="Times New Roman" w:eastAsia="Times New Roman" w:hAnsi="Times New Roman" w:cs="Times New Roman"/>
-                <w:color w:val="000000"/>
-                <w:sz w:val="22"/>
-                <w:szCs w:val="22"/>
-              </w:rPr>
-              <w:t xml:space="preserve"> </w:t>
+              <w:t xml:space="preserve">CONTRACTOR: Jane Q. Contractor</w:t>
             </w:r>
           </w:p>
           <w:p>
             <w:pPr>
               <w:spacing w:line="216" w:lineRule="auto"/>
-              <w:jc w:val="both"/>
-              <w:rPr>
-                <w:rFonts w:ascii="Times New Roman" w:eastAsia="Times New Roman" w:hAnsi="Times New Roman" w:cs="Times New Roman"/>
-                <w:b/>
-                <w:bCs/>
-                <w:color w:val="000000"/>
-                <w:sz w:val="22"/>
-                <w:szCs w:val="22"/>
-              </w:rPr>
-            </w:pPr>
-          </w:p>
-          <w:p>
-            <w:pPr>
-              <w:spacing w:line="216" w:lineRule="auto"/>
-              <w:jc w:val="both"/>
-              <w:rPr>
-                <w:rFonts w:ascii="Times New Roman" w:eastAsia="Times New Roman" w:hAnsi="Times New Roman" w:cs="Times New Roman"/>
-                <w:b/>
-                <w:bCs/>
-                <w:color w:val="000000"/>
-                <w:sz w:val="22"/>
-                <w:szCs w:val="22"/>
-              </w:rPr>
-            </w:pPr>
-          </w:p>
-          <w:p>
-            <w:pPr>
-              <w:spacing w:line="216" w:lineRule="auto"/>
-              <w:jc w:val="both"/>
-              <w:rPr>
-                <w:rFonts w:ascii="Times New Roman" w:eastAsia="Times New Roman" w:hAnsi="Times New Roman" w:cs="Times New Roman"/>
-                <w:b/>
-                <w:bCs/>
-                <w:color w:val="000000"/>
-                <w:sz w:val="22"/>
-                <w:szCs w:val="22"/>
-              </w:rPr>
-            </w:pPr>
-            <w:proofErr w:type="gramStart"/>
-            <w:r>
-              <w:rPr>
-                <w:rFonts w:ascii="Times New Roman" w:eastAsia="Times New Roman" w:hAnsi="Times New Roman" w:cs="Times New Roman"/>
-                <w:b/>
-                <w:bCs/>
-                <w:color w:val="000000"/>
-                <w:sz w:val="22"/>
-                <w:szCs w:val="22"/>
-              </w:rPr>
-              <w:t>Date:_</w:t>
-            </w:r>
-            <w:proofErr w:type="gramEnd"/>
-            <w:r>
-              <w:rPr>
-                <w:rFonts w:ascii="Times New Roman" w:eastAsia="Times New Roman" w:hAnsi="Times New Roman" w:cs="Times New Roman"/>
-                <w:b/>
-                <w:bCs/>
-                <w:color w:val="000000"/>
-                <w:sz w:val="22"/>
-                <w:szCs w:val="22"/>
-              </w:rPr>
-              <w:t xml:space="preserve">__________________           </w:t>
-            </w:r>
-          </w:p>
-        </w:tc>
-        <w:tc>
-          <w:tcPr>
-            <w:tcW w:w="5035" w:type="dxa"/>
-            <w:vAlign w:val="bottom"/>
-          </w:tcPr>
-          <w:p>
-            <w:pPr>
-              <w:spacing w:line="216" w:lineRule="auto"/>
-              <w:jc w:val="both"/>
-              <w:rPr>
-                <w:rFonts w:ascii="Times New Roman" w:eastAsia="Times New Roman" w:hAnsi="Times New Roman" w:cs="Times New Roman"/>
-                <w:color w:val="000000"/>
-                <w:sz w:val="22"/>
-                <w:szCs w:val="22"/>
-              </w:rPr>
             </w:pPr>
             <w:r>
               <w:rPr>
                 <w:rFonts w:ascii="Times New Roman" w:eastAsia="Times New Roman" w:hAnsi="Times New Roman" w:cs="Times New Roman"/>
-                <w:color w:val="000000"/>
                 <w:sz w:val="22"/>
                 <w:szCs w:val="22"/>
               </w:rPr>
-              <w:t xml:space="preserve">Jane Q. Contractor </w:t>
+              <w:t xml:space="preserve">By: _____________________________ (SEAL)</w:t>
             </w:r>
           </w:p>
           <w:p>
             <w:pPr>
               <w:spacing w:line="216" w:lineRule="auto"/>
+            </w:pPr>
+            <w:r>
               <w:rPr>
                 <w:rFonts w:ascii="Times New Roman" w:eastAsia="Times New Roman" w:hAnsi="Times New Roman" w:cs="Times New Roman"/>
-                <w:b/>
-                <w:bCs/>
-                <w:color w:val="000000"/>
                 <w:sz w:val="22"/>
                 <w:szCs w:val="22"/>
               </w:rPr>
-            </w:pPr>
+              <w:t xml:space="preserve">Confirmed Contractor Signatory</w:t>
+            </w:r>
           </w:p>
           <w:p>
             <w:pPr>
               <w:spacing w:line="216" w:lineRule="auto"/>
-              <w:rPr>
-                <w:rFonts w:ascii="Times New Roman" w:eastAsia="Times New Roman" w:hAnsi="Times New Roman" w:cs="Times New Roman"/>
-                <w:b/>
-                <w:bCs/>
-                <w:color w:val="000000"/>
-                <w:sz w:val="22"/>
-                <w:szCs w:val="22"/>
-              </w:rPr>
-            </w:pPr>
-          </w:p>
-          <w:p>
-            <w:pPr>
-              <w:spacing w:line="216" w:lineRule="auto"/>
-              <w:rPr>
-                <w:rFonts w:ascii="Times New Roman" w:eastAsia="Times New Roman" w:hAnsi="Times New Roman" w:cs="Times New Roman"/>
-                <w:b/>
-                <w:bCs/>
-                <w:color w:val="000000"/>
-                <w:sz w:val="22"/>
-                <w:szCs w:val="22"/>
-              </w:rPr>
-            </w:pPr>
-            <w:proofErr w:type="gramStart"/>
-            <w:r>
-              <w:rPr>
-                <w:rFonts w:ascii="Times New Roman" w:eastAsia="Times New Roman" w:hAnsi="Times New Roman" w:cs="Times New Roman"/>
-                <w:b/>
-                <w:bCs/>
-                <w:color w:val="000000"/>
-                <w:sz w:val="22"/>
-                <w:szCs w:val="22"/>
-              </w:rPr>
-              <w:t>Date:_</w:t>
-            </w:r>
-            <w:proofErr w:type="gramEnd"/>
-            <w:r>
-              <w:rPr>
-                <w:rFonts w:ascii="Times New Roman" w:eastAsia="Times New Roman" w:hAnsi="Times New Roman" w:cs="Times New Roman"/>
-                <w:b/>
-                <w:bCs/>
-                <w:color w:val="000000"/>
-                <w:sz w:val="22"/>
-                <w:szCs w:val="22"/>
-              </w:rPr>
-              <w:t xml:space="preserve">__________________           </w:t>
-            </w:r>
-          </w:p>
-        </w:tc>
-      </w:tr>
-      <w:tr>
-        <w:tc>
-          <w:tcPr>
-            <w:tcW w:w="5035" w:type="dxa"/>
-          </w:tcPr>
-          <w:p>
-            <w:pPr>
-              <w:spacing w:line="216" w:lineRule="auto"/>
-              <w:jc w:val="both"/>
-              <w:rPr>
-                <w:rFonts w:ascii="Times New Roman" w:eastAsia="Times New Roman" w:hAnsi="Times New Roman" w:cs="Times New Roman"/>
-                <w:color w:val="000000"/>
-                <w:sz w:val="22"/>
-                <w:szCs w:val="22"/>
-              </w:rPr>
             </w:pPr>
             <w:r>
               <w:rPr>
                 <w:rFonts w:ascii="Times New Roman" w:eastAsia="Times New Roman" w:hAnsi="Times New Roman" w:cs="Times New Roman"/>
-                <w:color w:val="000000"/>
                 <w:sz w:val="22"/>
                 <w:szCs w:val="22"/>
               </w:rPr>
-              <w:t xml:space="preserve">2026-07-14 </w:t>
-            </w:r>
-          </w:p>
-        </w:tc>
-        <w:tc>
-          <w:tcPr>
-            <w:tcW w:w="5035" w:type="dxa"/>
-            <w:vAlign w:val="bottom"/>
-          </w:tcPr>
-          <w:p>
-            <w:pPr>
-              <w:spacing w:line="216" w:lineRule="auto"/>
-              <w:jc w:val="both"/>
-              <w:rPr>
-                <w:rFonts w:ascii="Times New Roman" w:eastAsia="Times New Roman" w:hAnsi="Times New Roman" w:cs="Times New Roman"/>
-                <w:color w:val="000000"/>
-                <w:sz w:val="22"/>
-                <w:szCs w:val="22"/>
-              </w:rPr>
-            </w:pPr>
-            <w:r>
-              <w:rPr>
-                <w:rFonts w:ascii="Times New Roman" w:eastAsia="Times New Roman" w:hAnsi="Times New Roman" w:cs="Times New Roman"/>
-                <w:color w:val="000000"/>
-                <w:sz w:val="22"/>
-                <w:szCs w:val="22"/>
-              </w:rPr>
-              <w:t xml:space="preserve">2026-07-14</w:t>
+              <w:t xml:space="preserve">Date: 2026-07-15</w:t>
             </w:r>
           </w:p>
         </w:tc>

</xml_diff>

<commit_message>
fix: close p0 migration and provenance trust gaps
</commit_message>
<xml_diff>
--- a/demo-output/accepted-generation-1.docx
+++ b/demo-output/accepted-generation-1.docx
@@ -25,6 +25,21 @@
           <w:szCs w:val="26"/>
         </w:rPr>
         <w:t>INDEPENDENT CONTRACTOR AGREEMENT</w:t>
+      </w:r>
+    </w:p>
+    <w:p>
+      <w:pPr>
+        <w:spacing w:line="216" w:lineRule="auto"/>
+      </w:pPr>
+      <w:r>
+        <w:rPr>
+          <w:rFonts w:ascii="Times New Roman" w:eastAsia="Times New Roman" w:hAnsi="Times New Roman" w:cs="Times New Roman"/>
+          <w:b/>
+          <w:bCs/>
+          <w:sz w:val="22"/>
+          <w:szCs w:val="22"/>
+        </w:rPr>
+        <w:t xml:space="preserve">DEMONSTRATION DOCUMENT — NOT REPRESENTED AS LEGAL ADVICE OR A COMMERCIAL REMEDY</w:t>
       </w:r>
     </w:p>
     <w:p>
@@ -242,12 +257,6 @@
             <w:r>
               <w:t xml:space="preserve">Provide the expressly reviewed services and written deliverables described by the parties</w:t>
             </w:r>
-            <w:r>
-              <w:br/>
-            </w:r>
-            <w:r>
-              <w:t xml:space="preserve">Compensation structure: Fixed fee.</w:t>
-            </w:r>
           </w:p>
           <w:p>
             <w:pPr>
@@ -293,38 +302,15 @@
     </w:p>
     <w:p>
       <w:pPr>
-        <w:numPr>
-          <w:ilvl w:val="0"/>
-          <w:numId w:val="3"/>
-        </w:numPr>
-        <w:tabs>
-          <w:tab w:val="left" w:pos="0"/>
-        </w:tabs>
-        <w:spacing w:line="216" w:lineRule="auto"/>
-        <w:ind w:left="0" w:firstLine="720"/>
-        <w:jc w:val="both"/>
-      </w:pPr>
-      <w:r>
-        <w:rPr>
-          <w:rFonts w:ascii="Times New Roman" w:eastAsia="Times New Roman" w:hAnsi="Times New Roman" w:cs="Times New Roman"/>
-          <w:b/>
-          <w:bCs/>
-          <w:i/>
-          <w:iCs/>
-          <w:color w:val="000000"/>
-          <w:sz w:val="22"/>
-          <w:szCs w:val="22"/>
-        </w:rPr>
-        <w:t>EXPENSES AND COMPENSATION</w:t>
-      </w:r>
-      <w:r>
-        <w:rPr>
-          <w:rFonts w:ascii="Times New Roman" w:eastAsia="Times New Roman" w:hAnsi="Times New Roman" w:cs="Times New Roman"/>
-          <w:color w:val="000000"/>
-          <w:sz w:val="22"/>
-          <w:szCs w:val="22"/>
-        </w:rPr>
-        <w:t xml:space="preserve"> - Owner's obligation to Contractor is to provide the compensation structure expressly confirmed in the Scope of Agreement.  Owner shall have no additional or further obligation to pay or reimburse Contractor for expenses of overhead, insurance, taxes, vehicle use or otherwise, except as the parties may agree by written agreement signed by both parties.</w:t>
+        <w:spacing w:line="216" w:lineRule="auto"/>
+      </w:pPr>
+      <w:r>
+        <w:rPr>
+          <w:rFonts w:ascii="Times New Roman" w:eastAsia="Times New Roman" w:hAnsi="Times New Roman" w:cs="Times New Roman"/>
+          <w:sz w:val="22"/>
+          <w:szCs w:val="22"/>
+        </w:rPr>
+        <w:t xml:space="preserve">EXPENSES AND COMPENSATION - Owner's obligation to Contractor is to pay the fixed-fee compensation expressly confirmed by the parties. Owner shall have no additional or further obligation to pay or reimburse Contractor for expenses of overhead, insurance, taxes, vehicle use or otherwise, except as the parties may agree by written agreement signed by both parties.</w:t>
       </w:r>
     </w:p>
     <w:p>
@@ -2258,11 +2244,13 @@
                 <w:sz w:val="22"/>
                 <w:szCs w:val="22"/>
               </w:rPr>
-              <w:t xml:space="preserve">Alex Owner</w:t>
+              <w:t xml:space="preserve">Name: Alex Owner</w:t>
             </w:r>
-            <w:r>
-              <w:br/>
-            </w:r>
+          </w:p>
+          <w:p>
+            <w:pPr>
+              <w:spacing w:line="216" w:lineRule="auto"/>
+            </w:pPr>
             <w:r>
               <w:rPr>
                 <w:rFonts w:ascii="Times New Roman" w:eastAsia="Times New Roman" w:hAnsi="Times New Roman" w:cs="Times New Roman"/>
@@ -2323,7 +2311,7 @@
                 <w:sz w:val="22"/>
                 <w:szCs w:val="22"/>
               </w:rPr>
-              <w:t xml:space="preserve">Confirmed Contractor Signatory</w:t>
+              <w:t xml:space="preserve">Name: Confirmed Contractor Signatory</w:t>
             </w:r>
           </w:p>
           <w:p>
@@ -2336,7 +2324,20 @@
                 <w:sz w:val="22"/>
                 <w:szCs w:val="22"/>
               </w:rPr>
-              <w:t xml:space="preserve">Date: 2026-07-15</w:t>
+              <w:t xml:space="preserve">Title/Capacity: Independent Contractor</w:t>
+            </w:r>
+          </w:p>
+          <w:p>
+            <w:pPr>
+              <w:spacing w:line="216" w:lineRule="auto"/>
+            </w:pPr>
+            <w:r>
+              <w:rPr>
+                <w:rFonts w:ascii="Times New Roman" w:eastAsia="Times New Roman" w:hAnsi="Times New Roman" w:cs="Times New Roman"/>
+                <w:sz w:val="22"/>
+                <w:szCs w:val="22"/>
+              </w:rPr>
+              <w:t xml:space="preserve">Date: </w:t>
             </w:r>
           </w:p>
         </w:tc>

</xml_diff>